<commit_message>
Add app screenshots to the APA article as evidence of the working interface
</commit_message>
<xml_diff>
--- a/final_article_APA.docx
+++ b/final_article_APA.docx
@@ -1491,6 +1491,161 @@
           <w:szCs w:val="24"/>
         </w:rPr>
         <w:t xml:space="preserve">not uniformly better: citation match dropped from 100% to 90% (Q10's incomplete compound citation) and average response time grew from 29.0s to 44.3s (the real cost of retrieving twice as much context). Both are disclosed, not smoothed over, consistent with the honesty standard set in the Module 7 report this project extends.</w:t>
+      </w:r>
+    </w:p>
+    <w:p>
+      <w:pPr>
+        <w:spacing w:after="240" w:before="360" w:line="480"/>
+        <w:jc w:val="center"/>
+      </w:pPr>
+      <w:r>
+        <w:rPr>
+          <w:rFonts w:ascii="Times New Roman" w:cs="Times New Roman" w:eastAsia="Times New Roman" w:hAnsi="Times New Roman"/>
+          <w:b/>
+          <w:bCs/>
+          <w:sz w:val="24"/>
+          <w:szCs w:val="24"/>
+        </w:rPr>
+        <w:t xml:space="preserve">Interactive Demonstration Application</w:t>
+      </w:r>
+    </w:p>
+    <w:p>
+      <w:pPr>
+        <w:spacing w:line="480"/>
+        <w:ind w:firstLine="720"/>
+        <w:jc w:val="left"/>
+      </w:pPr>
+      <w:r>
+        <w:rPr>
+          <w:rFonts w:ascii="Times New Roman" w:cs="Times New Roman" w:eastAsia="Times New Roman" w:hAnsi="Times New Roman"/>
+          <w:sz w:val="24"/>
+          <w:szCs w:val="24"/>
+        </w:rPr>
+        <w:t xml:space="preserve">As an optional high-code addition, a Streamlit chat-style interface (app/streamlit_app.py) was built over the same src/rag_pipeline.py functions used to produce every result in this article — there is no separate or simulated logic for the app. A user types a PMO question (or clicks one of three example buttons, including a compound question), and the app calls the real local Ollama embedding and generation endpoints, then displays the answer, the retrieved source documents, and the retrieved passages themselves for transparency. A visible warning states the system is a classroom prototype requiring human review, consistent with the Responsible AI section above.</w:t>
+      </w:r>
+    </w:p>
+    <w:p>
+      <w:pPr>
+        <w:spacing w:after="100" w:before="200"/>
+        <w:jc w:val="center"/>
+      </w:pPr>
+      <w:r>
+        <w:drawing>
+          <wp:inline distT="0" distB="0" distL="0" distR="0">
+            <wp:extent cx="4953000" cy="3533775"/>
+            <wp:effectExtent t="0" r="0" b="0" l="0"/>
+            <wp:docPr id="1" name="" descr="" title=""/>
+            <wp:cNvGraphicFramePr>
+              <a:graphicFrameLocks xmlns:a="http://schemas.openxmlformats.org/drawingml/2006/main" noChangeAspect="1"/>
+            </wp:cNvGraphicFramePr>
+            <a:graphic xmlns:a="http://schemas.openxmlformats.org/drawingml/2006/main">
+              <a:graphicData uri="http://schemas.openxmlformats.org/drawingml/2006/picture">
+                <pic:pic xmlns:pic="http://schemas.openxmlformats.org/drawingml/2006/picture">
+                  <pic:nvPicPr>
+                    <pic:cNvPr id="0" name="" descr=""/>
+                    <pic:cNvPicPr>
+                      <a:picLocks noChangeAspect="1" noChangeArrowheads="1"/>
+                    </pic:cNvPicPr>
+                  </pic:nvPicPr>
+                  <pic:blipFill>
+                    <a:blip r:embed="rId11" cstate="none"/>
+                    <a:srcRect/>
+                    <a:stretch>
+                      <a:fillRect/>
+                    </a:stretch>
+                  </pic:blipFill>
+                  <pic:spPr bwMode="auto">
+                    <a:xfrm>
+                      <a:off x="0" y="0"/>
+                      <a:ext cx="4953000" cy="3533775"/>
+                    </a:xfrm>
+                    <a:prstGeom prst="rect">
+                      <a:avLst/>
+                    </a:prstGeom>
+                  </pic:spPr>
+                </pic:pic>
+              </a:graphicData>
+            </a:graphic>
+          </wp:inline>
+        </w:drawing>
+      </w:r>
+    </w:p>
+    <w:p>
+      <w:pPr>
+        <w:spacing w:after="240"/>
+        <w:jc w:val="center"/>
+      </w:pPr>
+      <w:r>
+        <w:rPr>
+          <w:rFonts w:ascii="Times New Roman" w:cs="Times New Roman" w:eastAsia="Times New Roman" w:hAnsi="Times New Roman"/>
+          <w:i/>
+          <w:iCs/>
+          <w:sz w:val="20"/>
+          <w:szCs w:val="20"/>
+        </w:rPr>
+        <w:t xml:space="preserve">Figure 4. App home screen: knowledge base list, pipeline info, and example-question buttons.</w:t>
+      </w:r>
+    </w:p>
+    <w:p>
+      <w:pPr>
+        <w:spacing w:after="100" w:before="200"/>
+        <w:jc w:val="center"/>
+      </w:pPr>
+      <w:r>
+        <w:drawing>
+          <wp:inline distT="0" distB="0" distL="0" distR="0">
+            <wp:extent cx="4953000" cy="3209925"/>
+            <wp:effectExtent t="0" r="0" b="0" l="0"/>
+            <wp:docPr id="1" name="" descr="" title=""/>
+            <wp:cNvGraphicFramePr>
+              <a:graphicFrameLocks xmlns:a="http://schemas.openxmlformats.org/drawingml/2006/main" noChangeAspect="1"/>
+            </wp:cNvGraphicFramePr>
+            <a:graphic xmlns:a="http://schemas.openxmlformats.org/drawingml/2006/main">
+              <a:graphicData uri="http://schemas.openxmlformats.org/drawingml/2006/picture">
+                <pic:pic xmlns:pic="http://schemas.openxmlformats.org/drawingml/2006/picture">
+                  <pic:nvPicPr>
+                    <pic:cNvPr id="0" name="" descr=""/>
+                    <pic:cNvPicPr>
+                      <a:picLocks noChangeAspect="1" noChangeArrowheads="1"/>
+                    </pic:cNvPicPr>
+                  </pic:nvPicPr>
+                  <pic:blipFill>
+                    <a:blip r:embed="rId12" cstate="none"/>
+                    <a:srcRect/>
+                    <a:stretch>
+                      <a:fillRect/>
+                    </a:stretch>
+                  </pic:blipFill>
+                  <pic:spPr bwMode="auto">
+                    <a:xfrm>
+                      <a:off x="0" y="0"/>
+                      <a:ext cx="4953000" cy="3209925"/>
+                    </a:xfrm>
+                    <a:prstGeom prst="rect">
+                      <a:avLst/>
+                    </a:prstGeom>
+                  </pic:spPr>
+                </pic:pic>
+              </a:graphicData>
+            </a:graphic>
+          </wp:inline>
+        </w:drawing>
+      </w:r>
+    </w:p>
+    <w:p>
+      <w:pPr>
+        <w:spacing w:after="240"/>
+        <w:jc w:val="center"/>
+      </w:pPr>
+      <w:r>
+        <w:rPr>
+          <w:rFonts w:ascii="Times New Roman" w:cs="Times New Roman" w:eastAsia="Times New Roman" w:hAnsi="Times New Roman"/>
+          <w:i/>
+          <w:iCs/>
+          <w:sz w:val="20"/>
+          <w:szCs w:val="20"/>
+        </w:rPr>
+        <w:t xml:space="preserve">Figure 5. A real, live answer to the compound RAID-vs-RACI question (Q9) — both required documents retrieved at top-4 and a correct, cited answer generated in the browser.</w:t>
       </w:r>
     </w:p>
     <w:p>

</xml_diff>

<commit_message>
Add GitHub repo link to the article title page
</commit_message>
<xml_diff>
--- a/final_article_APA.docx
+++ b/final_article_APA.docx
@@ -93,6 +93,30 @@
           <w:szCs w:val="24"/>
         </w:rPr>
         <w:t xml:space="preserve">Module 8 Final Project</w:t>
+      </w:r>
+    </w:p>
+    <w:p>
+      <w:pPr>
+        <w:spacing w:before="480" w:line="480"/>
+        <w:jc w:val="center"/>
+      </w:pPr>
+      <w:r>
+        <w:rPr>
+          <w:rFonts w:ascii="Times New Roman" w:cs="Times New Roman" w:eastAsia="Times New Roman" w:hAnsi="Times New Roman"/>
+          <w:sz w:val="24"/>
+          <w:szCs w:val="24"/>
+        </w:rPr>
+        <w:t xml:space="preserve">Code, data, notebook, and results available at: </w:t>
+      </w:r>
+      <w:r>
+        <w:rPr>
+          <w:rFonts w:ascii="Times New Roman" w:cs="Times New Roman" w:eastAsia="Times New Roman" w:hAnsi="Times New Roman"/>
+          <w:b/>
+          <w:bCs/>
+          <w:sz w:val="24"/>
+          <w:szCs w:val="24"/>
+        </w:rPr>
+        <w:t xml:space="preserve">https://github.com/Crist441/mai600-module8-final-capstone</w:t>
       </w:r>
     </w:p>
     <w:p>

</xml_diff>